<commit_message>
actualizacion guia y ppt
</commit_message>
<xml_diff>
--- a/Fase 1/Evidencias Grupales/1.5_GuiaEstudiante_Fase 1_Definicion Proyecto APT (Español).docx
+++ b/Fase 1/Evidencias Grupales/1.5_GuiaEstudiante_Fase 1_Definicion Proyecto APT (Español).docx
@@ -495,6 +495,42 @@
                 <w:rFonts w:ascii="Calibri" w:hAnsi="Calibri"/>
               </w:rPr>
               <w:t>18.342.515-3 /</w:t>
+            </w:r>
+            <w:r>
+              <w:rPr>
+                <w:rFonts w:ascii="Calibri" w:hAnsi="Calibri"/>
+              </w:rPr>
+              <w:t xml:space="preserve"> </w:t>
+            </w:r>
+            <w:r>
+              <w:rPr>
+                <w:rFonts w:ascii="Calibri" w:hAnsi="Calibri"/>
+              </w:rPr>
+              <w:t>18</w:t>
+            </w:r>
+            <w:r>
+              <w:rPr>
+                <w:rFonts w:ascii="Calibri" w:hAnsi="Calibri"/>
+              </w:rPr>
+              <w:t>.</w:t>
+            </w:r>
+            <w:r>
+              <w:rPr>
+                <w:rFonts w:ascii="Calibri" w:hAnsi="Calibri"/>
+              </w:rPr>
+              <w:t>357</w:t>
+            </w:r>
+            <w:r>
+              <w:rPr>
+                <w:rFonts w:ascii="Calibri" w:hAnsi="Calibri"/>
+              </w:rPr>
+              <w:t>.</w:t>
+            </w:r>
+            <w:r>
+              <w:rPr>
+                <w:rFonts w:ascii="Calibri" w:hAnsi="Calibri"/>
+              </w:rPr>
+              <w:t>203-2</w:t>
             </w:r>
           </w:p>
         </w:tc>
@@ -7953,12 +7989,9 @@
 </file>
 
 <file path=customXml/item1.xml><?xml version="1.0" encoding="utf-8"?>
-<?mso-contentType ?>
-<FormTemplates xmlns="http://schemas.microsoft.com/sharepoint/v3/contenttype/forms">
-  <Display>DocumentLibraryForm</Display>
-  <Edit>DocumentLibraryForm</Edit>
-  <New>DocumentLibraryForm</New>
-</FormTemplates>
+<p:properties xmlns:p="http://schemas.microsoft.com/office/2006/metadata/properties" xmlns:xsi="http://www.w3.org/2001/XMLSchema-instance" xmlns:pc="http://schemas.microsoft.com/office/infopath/2007/PartnerControls">
+  <documentManagement/>
+</p:properties>
 </file>
 
 <file path=customXml/item2.xml><?xml version="1.0" encoding="utf-8"?>
@@ -8094,15 +8127,19 @@
 </file>
 
 <file path=customXml/item3.xml><?xml version="1.0" encoding="utf-8"?>
-<p:properties xmlns:p="http://schemas.microsoft.com/office/2006/metadata/properties" xmlns:xsi="http://www.w3.org/2001/XMLSchema-instance" xmlns:pc="http://schemas.microsoft.com/office/infopath/2007/PartnerControls">
-  <documentManagement/>
-</p:properties>
+<?mso-contentType ?>
+<FormTemplates xmlns="http://schemas.microsoft.com/sharepoint/v3/contenttype/forms">
+  <Display>DocumentLibraryForm</Display>
+  <Edit>DocumentLibraryForm</Edit>
+  <New>DocumentLibraryForm</New>
+</FormTemplates>
 </file>
 
 <file path=customXml/itemProps1.xml><?xml version="1.0" encoding="utf-8"?>
-<ds:datastoreItem xmlns:ds="http://schemas.openxmlformats.org/officeDocument/2006/customXml" ds:itemID="{F3E3E2F7-59E7-4722-B872-D023DC9D1CC1}">
+<ds:datastoreItem xmlns:ds="http://schemas.openxmlformats.org/officeDocument/2006/customXml" ds:itemID="{38174882-579A-45DC-A704-C035A9357F73}">
   <ds:schemaRefs>
-    <ds:schemaRef ds:uri="http://schemas.microsoft.com/sharepoint/v3/contenttype/forms"/>
+    <ds:schemaRef ds:uri="http://schemas.microsoft.com/office/2006/metadata/properties"/>
+    <ds:schemaRef ds:uri="http://schemas.microsoft.com/office/infopath/2007/PartnerControls"/>
   </ds:schemaRefs>
 </ds:datastoreItem>
 </file>
@@ -8126,10 +8163,9 @@
 </file>
 
 <file path=customXml/itemProps3.xml><?xml version="1.0" encoding="utf-8"?>
-<ds:datastoreItem xmlns:ds="http://schemas.openxmlformats.org/officeDocument/2006/customXml" ds:itemID="{38174882-579A-45DC-A704-C035A9357F73}">
+<ds:datastoreItem xmlns:ds="http://schemas.openxmlformats.org/officeDocument/2006/customXml" ds:itemID="{F3E3E2F7-59E7-4722-B872-D023DC9D1CC1}">
   <ds:schemaRefs>
-    <ds:schemaRef ds:uri="http://schemas.microsoft.com/office/2006/metadata/properties"/>
-    <ds:schemaRef ds:uri="http://schemas.microsoft.com/office/infopath/2007/PartnerControls"/>
+    <ds:schemaRef ds:uri="http://schemas.microsoft.com/sharepoint/v3/contenttype/forms"/>
   </ds:schemaRefs>
 </ds:datastoreItem>
 </file>
</xml_diff>